<commit_message>
Fix covenant forecast task
</commit_message>
<xml_diff>
--- a/companies/alder-ridge/source-files/Shared/Finance/Treasury/FY27 working/treasury and bank review notes - 7.4 DC.docx
+++ b/companies/alder-ridge/source-files/Shared/Finance/Treasury/FY27 working/treasury and bank review notes - 7.4 DC.docx
@@ -967,7 +967,7 @@
                 <w:color w:val="000000"/>
                 <w:sz w:val="22"/>
               </w:rPr>
-              <w:t>Covenant policy, Debt Schedule, Forecast Inputs</w:t>
+              <w:t>Covenant policy, Debt Schedule, Forecast Inputs, Historical Covenant Inputs</w:t>
             </w:r>
           </w:p>
         </w:tc>
@@ -1915,12 +1915,17 @@
     </w:p>
     <w:p>
       <w:r>
-        <w:t>Decision 2: Test leverage on trailing-four-quarter covenant EBITDA and FCCR on trailing EBITDA divided by trailing cash interest, capex, cash taxes, and distributions.</w:t>
+        <w:t>Decision 2: Test leverage on trailing-four-quarter covenant EBITDA using the executed 3.00x maximum.</w:t>
       </w:r>
     </w:p>
     <w:p>
       <w:r>
-        <w:t>Decision 3: At the first leverage breach, calculate the immediate debt paydown required to reach the covenant maximum; do not solve an FCCR breach with a debt plug.</w:t>
+        <w:t>Decision 3: Calculate FCCR under the executed amendment as trailing EBITDA less cash taxes and unfunded capex, divided by cash interest plus scheduled principal.</w:t>
+      </w:r>
+    </w:p>
+    <w:p>
+      <w:r>
+        <w:t>Decision 4: At the first leverage breach, calculate the immediate debt paydown required to reach the covenant maximum; do not solve an FCCR breach with a debt plug.</w:t>
       </w:r>
     </w:p>
     <w:p>

</xml_diff>